<commit_message>
Linal proect1: link fixed
</commit_message>
<xml_diff>
--- a/linear_algebra/project1/task2.docx
+++ b/linear_algebra/project1/task2.docx
@@ -43,15 +43,7 @@
         <w:t>-</w:t>
       </w:r>
       <w:r>
-        <w:t xml:space="preserve">нибудь ключ размера 2 × 2. В идеале автоматизировать процесс так, чтобы ключ сгенерировался </w:t>
-      </w:r>
-      <w:proofErr w:type="gramStart"/>
-      <w:r>
-        <w:t>случайным образом</w:t>
-      </w:r>
-      <w:proofErr w:type="gramEnd"/>
-      <w:r>
-        <w:t xml:space="preserve"> и вы не знали его до самого конца. </w:t>
+        <w:t xml:space="preserve">нибудь ключ размера 2 × 2. В идеале автоматизировать процесс так, чтобы ключ сгенерировался случайным образом и вы не знали его до самого конца. </w:t>
       </w:r>
     </w:p>
     <w:p>
@@ -2044,23 +2036,7 @@
           <w:sz w:val="28"/>
           <w:szCs w:val="28"/>
         </w:rPr>
-        <w:t xml:space="preserve">K = </w:t>
-      </w:r>
-      <w:proofErr w:type="gramStart"/>
-      <w:r>
-        <w:rPr>
-          <w:sz w:val="28"/>
-          <w:szCs w:val="28"/>
-        </w:rPr>
-        <w:t>[ k</w:t>
-      </w:r>
-      <w:proofErr w:type="gramEnd"/>
-      <w:r>
-        <w:rPr>
-          <w:sz w:val="28"/>
-          <w:szCs w:val="28"/>
-        </w:rPr>
-        <w:t>₁₁</w:t>
+        <w:t>K = [ k₁₁</w:t>
       </w:r>
       <w:r>
         <w:rPr>
@@ -2092,23 +2068,7 @@
           <w:sz w:val="28"/>
           <w:szCs w:val="28"/>
         </w:rPr>
-        <w:t xml:space="preserve">       </w:t>
-      </w:r>
-      <w:proofErr w:type="gramStart"/>
-      <w:r>
-        <w:rPr>
-          <w:sz w:val="28"/>
-          <w:szCs w:val="28"/>
-        </w:rPr>
-        <w:t>[ k</w:t>
-      </w:r>
-      <w:proofErr w:type="gramEnd"/>
-      <w:r>
-        <w:rPr>
-          <w:sz w:val="28"/>
-          <w:szCs w:val="28"/>
-        </w:rPr>
-        <w:t>₂₁</w:t>
+        <w:t xml:space="preserve">       [ k₂₁</w:t>
       </w:r>
       <w:r>
         <w:rPr>
@@ -2181,61 +2141,43 @@
         </w:rPr>
         <w:t xml:space="preserve"> </w:t>
       </w:r>
-      <w:proofErr w:type="gramStart"/>
       <w:r>
         <w:rPr>
           <w:sz w:val="28"/>
           <w:szCs w:val="28"/>
         </w:rPr>
-        <w:t>[ p</w:t>
-      </w:r>
-      <w:proofErr w:type="gramEnd"/>
-      <w:r>
+        <w:t xml:space="preserve">[ p₁ </w:t>
+      </w:r>
+    </w:p>
+    <w:p>
+      <w:pPr>
+        <w:pStyle w:val="p1"/>
         <w:rPr>
           <w:sz w:val="28"/>
           <w:szCs w:val="28"/>
         </w:rPr>
-        <w:t xml:space="preserve">₁ </w:t>
-      </w:r>
-    </w:p>
-    <w:p>
-      <w:pPr>
-        <w:pStyle w:val="p1"/>
+      </w:pPr>
+      <w:r>
         <w:rPr>
           <w:sz w:val="28"/>
           <w:szCs w:val="28"/>
         </w:rPr>
-      </w:pPr>
+        <w:t xml:space="preserve">       </w:t>
+      </w:r>
       <w:r>
         <w:rPr>
           <w:sz w:val="28"/>
           <w:szCs w:val="28"/>
         </w:rPr>
-        <w:t xml:space="preserve">       </w:t>
+        <w:t xml:space="preserve"> </w:t>
       </w:r>
       <w:r>
         <w:rPr>
           <w:sz w:val="28"/>
           <w:szCs w:val="28"/>
         </w:rPr>
-        <w:t xml:space="preserve"> </w:t>
-      </w:r>
-      <w:r>
-        <w:rPr>
-          <w:sz w:val="28"/>
-          <w:szCs w:val="28"/>
-        </w:rPr>
-        <w:t xml:space="preserve"> p</w:t>
-      </w:r>
-      <w:proofErr w:type="gramStart"/>
-      <w:r>
-        <w:rPr>
-          <w:sz w:val="28"/>
-          <w:szCs w:val="28"/>
-        </w:rPr>
-        <w:t>₂ ]</w:t>
-      </w:r>
-      <w:proofErr w:type="gramEnd"/>
+        <w:t xml:space="preserve"> p₂ ]</w:t>
+      </w:r>
     </w:p>
     <w:p>
       <w:pPr>
@@ -2578,13 +2520,8 @@
         </w:rPr>
       </w:pPr>
       <w:r>
-        <w:t xml:space="preserve">Если </w:t>
-      </w:r>
-      <w:proofErr w:type="gramStart"/>
-      <w:r>
-        <w:t>НОД(</w:t>
-      </w:r>
-      <w:proofErr w:type="gramEnd"/>
+        <w:t>Если НОД(</w:t>
+      </w:r>
       <w:r>
         <w:rPr>
           <w:lang w:val="en-US"/>
@@ -3356,11 +3293,9 @@
       <w:r>
         <w:t xml:space="preserve"> </w:t>
       </w:r>
-      <w:proofErr w:type="gramStart"/>
       <w:r>
         <w:t>НОД(</w:t>
       </w:r>
-      <w:proofErr w:type="gramEnd"/>
       <w:r>
         <w:rPr>
           <w:lang w:val="en-US"/>
@@ -3604,13 +3539,8 @@
       <w:r>
         <w:t xml:space="preserve">Зашифрованный текст1 = </w:t>
       </w:r>
-      <w:proofErr w:type="gramStart"/>
-      <w:r>
-        <w:t>У,ЕИВАЬР</w:t>
-      </w:r>
-      <w:proofErr w:type="gramEnd"/>
-      <w:r>
-        <w:t>?МЧЮ</w:t>
+      <w:r>
+        <w:t>У,ЕИВАЬР?МЧЮ</w:t>
       </w:r>
     </w:p>
     <w:p>
@@ -3620,11 +3550,9 @@
       <w:r>
         <w:t xml:space="preserve"> = </w:t>
       </w:r>
-      <w:proofErr w:type="gramStart"/>
       <w:r>
         <w:t>Э!Е</w:t>
       </w:r>
-      <w:proofErr w:type="gramEnd"/>
       <w:r>
         <w:rPr>
           <w:rFonts w:ascii="MS Gothic" w:eastAsia="MS Gothic" w:hAnsi="MS Gothic" w:cs="MS Gothic" w:hint="eastAsia"/>
@@ -3745,41 +3673,25 @@
     </w:p>
     <w:p>
       <w:r>
+        <w:t xml:space="preserve">         34  8 0 16 12 30]</w:t>
+      </w:r>
+    </w:p>
+    <w:p/>
+    <w:p>
+      <w:r>
+        <w:t>Возьмём первые два столбца матрицы P:</w:t>
+      </w:r>
+    </w:p>
+    <w:p>
+      <w:r>
+        <w:t>P₀ =[ 17 17</w:t>
+      </w:r>
+      <w:r>
+        <w:br/>
+      </w:r>
+      <w:r>
         <w:t xml:space="preserve">         </w:t>
       </w:r>
-      <w:proofErr w:type="gramStart"/>
-      <w:r>
-        <w:t>34  8</w:t>
-      </w:r>
-      <w:proofErr w:type="gramEnd"/>
-      <w:r>
-        <w:t xml:space="preserve"> 0 16 12 30]</w:t>
-      </w:r>
-    </w:p>
-    <w:p/>
-    <w:p>
-      <w:r>
-        <w:t>Возьмём первые два столбца матрицы P:</w:t>
-      </w:r>
-    </w:p>
-    <w:p>
-      <w:r>
-        <w:t xml:space="preserve">P₀ </w:t>
-      </w:r>
-      <w:proofErr w:type="gramStart"/>
-      <w:r>
-        <w:t>=[ 17</w:t>
-      </w:r>
-      <w:proofErr w:type="gramEnd"/>
-      <w:r>
-        <w:t xml:space="preserve"> 17</w:t>
-      </w:r>
-      <w:r>
-        <w:br/>
-      </w:r>
-      <w:r>
-        <w:t xml:space="preserve">         </w:t>
-      </w:r>
       <w:r>
         <w:t>5 17 ]</w:t>
       </w:r>
@@ -3798,16 +3710,11 @@
       <w:r>
         <w:t xml:space="preserve">Так как </w:t>
       </w:r>
-      <w:proofErr w:type="gramStart"/>
       <w:r>
         <w:t>НОД</w:t>
       </w:r>
       <w:r>
-        <w:t>(</w:t>
-      </w:r>
-      <w:proofErr w:type="gramEnd"/>
-      <w:r>
-        <w:t>19, 37) = 1, матрица обратима по модулю 37.</w:t>
+        <w:t>(19, 37) = 1, матрица обратима по модулю 37.</w:t>
       </w:r>
     </w:p>
     <w:p/>
@@ -3845,15 +3752,7 @@
       </w:r>
       <w:r>
         <w:br/>
-        <w:t xml:space="preserve">−5 </w:t>
-      </w:r>
-      <w:proofErr w:type="gramStart"/>
-      <w:r>
-        <w:t>17 ]</w:t>
-      </w:r>
-      <w:proofErr w:type="gramEnd"/>
-      <w:r>
-        <w:t xml:space="preserve"> (mod 37)</w:t>
+        <w:t>−5 17 ] (mod 37)</w:t>
       </w:r>
     </w:p>
     <w:p>
@@ -3864,15 +3763,7 @@
     <w:p>
       <w:r>
         <w:lastRenderedPageBreak/>
-        <w:t xml:space="preserve">P₀⁻¹ </w:t>
-      </w:r>
-      <w:proofErr w:type="gramStart"/>
-      <w:r>
-        <w:t>=[ 34</w:t>
-      </w:r>
-      <w:proofErr w:type="gramEnd"/>
-      <w:r>
-        <w:t xml:space="preserve"> 3</w:t>
+        <w:t>P₀⁻¹ =[ 34 3</w:t>
       </w:r>
       <w:r>
         <w:br/>
@@ -3967,7 +3858,6 @@
       </w:r>
     </w:p>
     <w:p>
-      <w:proofErr w:type="gramStart"/>
       <w:r>
         <w:t>ПРИВЕТ,</w:t>
       </w:r>
@@ -3977,7 +3867,6 @@
         </w:rPr>
         <w:t>␣</w:t>
       </w:r>
-      <w:proofErr w:type="gramEnd"/>
       <w:r>
         <w:rPr>
           <w:rFonts w:cs="Times New Roman"/>
@@ -4054,7 +3943,7 @@
             <w:rStyle w:val="af3"/>
             <w:lang w:val="en-US"/>
           </w:rPr>
-          <w:t>linal</w:t>
+          <w:t>linear_algebra</w:t>
         </w:r>
         <w:r>
           <w:rPr>
@@ -4073,13 +3962,7 @@
           <w:rPr>
             <w:rStyle w:val="af3"/>
           </w:rPr>
-          <w:t>1</w:t>
-        </w:r>
-        <w:r>
-          <w:rPr>
-            <w:rStyle w:val="af3"/>
-          </w:rPr>
-          <w:t>/</w:t>
+          <w:t>1/</w:t>
         </w:r>
         <w:r>
           <w:rPr>
@@ -6312,6 +6195,7 @@
   <w:style w:type="character" w:default="1" w:styleId="a0">
     <w:name w:val="Default Paragraph Font"/>
     <w:uiPriority w:val="1"/>
+    <w:semiHidden/>
     <w:unhideWhenUsed/>
   </w:style>
   <w:style w:type="table" w:default="1" w:styleId="a1">

</xml_diff>